<commit_message>
Finalize v22 with verified compact figures
</commit_message>
<xml_diff>
--- a/word_output/2026.09.22v22.docx
+++ b/word_output/2026.09.22v22.docx
@@ -3094,7 +3094,7 @@
       <w:r>
         <w:drawing>
           <wp:inline xmlns:a="http://schemas.openxmlformats.org/drawingml/2006/main" xmlns:pic="http://schemas.openxmlformats.org/drawingml/2006/picture">
-            <wp:extent cx="5623560" cy="4031310"/>
+            <wp:extent cx="5623560" cy="4190610"/>
             <wp:docPr id="24" name="Picture 24"/>
             <wp:cNvGraphicFramePr>
               <a:graphicFrameLocks noChangeAspect="1"/>
@@ -3115,7 +3115,7 @@
                   <pic:spPr>
                     <a:xfrm>
                       <a:off x="0" y="0"/>
-                      <a:ext cx="5623560" cy="4031310"/>
+                      <a:ext cx="5623560" cy="4190610"/>
                     </a:xfrm>
                     <a:prstGeom prst="rect"/>
                   </pic:spPr>
@@ -11428,7 +11428,7 @@
       <w:r>
         <w:drawing>
           <wp:inline xmlns:a="http://schemas.openxmlformats.org/drawingml/2006/main" xmlns:pic="http://schemas.openxmlformats.org/drawingml/2006/picture">
-            <wp:extent cx="5715000" cy="4195614"/>
+            <wp:extent cx="5715000" cy="4200584"/>
             <wp:docPr id="25" name="Picture 25"/>
             <wp:cNvGraphicFramePr>
               <a:graphicFrameLocks noChangeAspect="1"/>
@@ -11449,7 +11449,7 @@
                   <pic:spPr>
                     <a:xfrm>
                       <a:off x="0" y="0"/>
-                      <a:ext cx="5715000" cy="4195614"/>
+                      <a:ext cx="5715000" cy="4200584"/>
                     </a:xfrm>
                     <a:prstGeom prst="rect"/>
                   </pic:spPr>
@@ -11471,7 +11471,7 @@
     <w:p>
       <w:pPr/>
       <w:r>
-        <w:t>图4(a)、(b)展示真实值、DLinear和本文方法在24个预测步上的轨迹，图4(c)、(d)给出对应的标准化绝对误差。Abilene示例中，本文方法在多数预测步上与真实值更接近；GÉANT示例中，两种方法的误差更为接近，不同预测步各有偏差。该图用于补充说明单个典型窗口中的预测形态，整体性能判断仍以表2和表3在全部测试样本、多个随机种子上的统计结果为准。</w:t>
+        <w:t>图4(a)、(b)展示真实值、DLinear和本文方法在24个预测步上的标准化预测轨迹，图4(c)、(d)给出对应的逐步标准化绝对误差。该代表性窗口中，Abilene上DLinear与本文方法的MAE分别为0.1057和0.0680；GÉANT上分别为0.2087和0.2094。因此，Abilene示例中本文方法整体误差更低，而GÉANT示例中两种方法较为接近。该图用于补充说明典型窗口中的预测形态，整体性能判断仍以表2和表3在全部测试样本、多个随机种子上的统计结果为准。</w:t>
       </w:r>
     </w:p>
     <w:p>

</xml_diff>

<commit_message>
Refresh v22 with publication-grade figures
</commit_message>
<xml_diff>
--- a/word_output/2026.09.22v22.docx
+++ b/word_output/2026.09.22v22.docx
@@ -3094,7 +3094,7 @@
       <w:r>
         <w:drawing>
           <wp:inline xmlns:a="http://schemas.openxmlformats.org/drawingml/2006/main" xmlns:pic="http://schemas.openxmlformats.org/drawingml/2006/picture">
-            <wp:extent cx="5623560" cy="4190610"/>
+            <wp:extent cx="5623560" cy="3811943"/>
             <wp:docPr id="24" name="Picture 24"/>
             <wp:cNvGraphicFramePr>
               <a:graphicFrameLocks noChangeAspect="1"/>
@@ -3115,7 +3115,7 @@
                   <pic:spPr>
                     <a:xfrm>
                       <a:off x="0" y="0"/>
-                      <a:ext cx="5623560" cy="4190610"/>
+                      <a:ext cx="5623560" cy="3811943"/>
                     </a:xfrm>
                     <a:prstGeom prst="rect"/>
                   </pic:spPr>
@@ -3137,7 +3137,7 @@
     <w:p>
       <w:pPr/>
       <w:r>
-        <w:t>尺度1保留原始96步输入；尺度2对相邻2点取平均后得到48步序列；尺度4对相邻4点取平均后得到24步序列。核对源数据可知，尺度2和尺度4分别与尺度1的2点、4点非重叠平均结果一致。随着尺度增大，局部波动逐渐被平滑，但整体变化趋势仍被保留，从而为后续3个DLinear专家提供侧重点不同的时间分辨率输入。</w:t>
+        <w:t>尺度1保留原始96步输入；尺度2对相邻2点取平均后得到48步序列；尺度4对相邻4点取平均后得到24步序列。核对源数据可知，尺度2和尺度4分别与尺度1的2点、4点非重叠平均结果一致。在该示例窗口中，3个尺度的标准差依次为0.071、0.067和0.061，尺度1到尺度4下降约13.7%。这说明随着尺度增大，局部波动逐渐被平滑，而较慢的变化趋势仍被保留，从而为后续3个DLinear专家提供侧重点不同的时间分辨率输入。</w:t>
       </w:r>
     </w:p>
     <w:p>
@@ -11418,7 +11418,7 @@
     <w:p>
       <w:pPr/>
       <w:r>
-        <w:t>平均指标能够反映整体误差水平，但不容易展示24步预测过程中预测轨迹与真实序列之间的局部差异。因此，图4给出随机种子42下的代表性测试窗口，并在下方同时绘制逐步绝对误差。样本选择不依据本文方法相对DLinear的提升幅度，而是先选择本文方法绝对误差接近全部测试窗口中位数的窗口，再选择该窗口中真实值波动程度接近通道中位数的非恒定OD变量，以避免只展示最有利案例。</w:t>
+        <w:t>平均指标能够反映整体误差水平，但不容易展示24步预测过程中预测轨迹与真实序列之间的局部差异。因此，图4给出随机种子42下的代表性测试窗口，并在下方绘制逐步误差差值，用于直接观察两个模型在各预测步上的误差差异。样本选择不依据本文方法相对DLinear的提升幅度，而是先选择本文方法绝对误差接近全部测试窗口中位数的窗口，再选择该窗口中真实值波动程度接近通道中位数的非恒定OD变量，以避免只展示最有利案例。</w:t>
       </w:r>
     </w:p>
     <w:p>
@@ -11428,7 +11428,7 @@
       <w:r>
         <w:drawing>
           <wp:inline xmlns:a="http://schemas.openxmlformats.org/drawingml/2006/main" xmlns:pic="http://schemas.openxmlformats.org/drawingml/2006/picture">
-            <wp:extent cx="5715000" cy="4200584"/>
+            <wp:extent cx="5715000" cy="3919938"/>
             <wp:docPr id="25" name="Picture 25"/>
             <wp:cNvGraphicFramePr>
               <a:graphicFrameLocks noChangeAspect="1"/>
@@ -11449,7 +11449,7 @@
                   <pic:spPr>
                     <a:xfrm>
                       <a:off x="0" y="0"/>
-                      <a:ext cx="5715000" cy="4200584"/>
+                      <a:ext cx="5715000" cy="3919938"/>
                     </a:xfrm>
                     <a:prstGeom prst="rect"/>
                   </pic:spPr>
@@ -11465,13 +11465,13 @@
         <w:jc w:val="center"/>
       </w:pPr>
       <w:r>
-        <w:t>图4 Abilene与GÉANT代表性测试窗口的24步预测及逐步绝对误差</w:t>
+        <w:t>图4 Abilene与GÉANT代表性测试窗口的24步预测及逐步误差差值</w:t>
       </w:r>
     </w:p>
     <w:p>
       <w:pPr/>
       <w:r>
-        <w:t>图4(a)、(b)展示真实值、DLinear和本文方法在24个预测步上的标准化预测轨迹，图4(c)、(d)给出对应的逐步标准化绝对误差。该代表性窗口中，Abilene上DLinear与本文方法的MAE分别为0.1057和0.0680；GÉANT上分别为0.2087和0.2094。因此，Abilene示例中本文方法整体误差更低，而GÉANT示例中两种方法较为接近。该图用于补充说明典型窗口中的预测形态，整体性能判断仍以表2和表3在全部测试样本、多个随机种子上的统计结果为准。</w:t>
+        <w:t>图4(a)、(b)展示真实值、DLinear和本文方法在24个预测步上的标准化预测轨迹；图4(c)、(d)绘制逐步误差差值ΔAE=|DLinear−真实值|−|本文方法−真实值|，正值表示本文方法在该预测步的绝对误差更小。列标题同时给出全部测试样本、随机种子42—44上的总体MSE结果：本文方法相对DLinear在Abilene和GÉANT上分别降低4.06%和4.43%。在图示代表性窗口中，Abilene上DLinear与本文方法的MAE分别为0.1057和0.0680；GÉANT上分别为0.2087和0.2094。因此，Abilene示例中本文方法的局部优势较明显，而GÉANT代表窗口基本持平；总体性能判断仍以全部测试样本和多个随机种子的统计结果为准。</w:t>
       </w:r>
     </w:p>
     <w:p>
@@ -13562,7 +13562,7 @@
           <w:color w:val="000000"/>
           <w:szCs w:val="21"/>
         </w:rPr>
-        <w:t>综合表2、表3和图3—图6可以形成一条较清晰的实验链。表2和图3用于比较本文方法与外部轻量基线的总体误差水平；图4补充展示代表性测试窗口中的24步预测轨迹和逐步绝对误差；表3和图5进一步控制专家结构，考察固定等权与样本级权重之间的差异；图6则从模型内部的尺度分配结果说明路由器在测试样本上形成了非等权的融合方式。各部分分别对应总体性能、局部预测形态、核心结构消融和内部权重行为，与第1节提出的多尺度专家和样本级路由设计相互对应。</w:t>
+        <w:t>综合表2、表3和图3—图6可以形成一条较清晰的实验链。表2和图3用于比较本文方法与外部轻量基线的总体误差水平；图4补充展示代表性测试窗口中的24步预测轨迹和逐步误差差值；表3和图5进一步控制专家结构，考察固定等权与样本级权重之间的差异；图6则从模型内部的尺度分配结果说明路由器在测试样本上形成了非等权的融合方式。各部分分别对应总体性能、局部预测形态、核心结构消融和内部权重行为，与第1节提出的多尺度专家和样本级路由设计相互对应。</w:t>
       </w:r>
       <w:r>
         <w:rPr>

</xml_diff>